<commit_message>
Added a folder called SCREENSHOTS
Social Spark app screenshots
</commit_message>
<xml_diff>
--- a/README.docx
+++ b/README.docx
@@ -1401,17 +1401,6 @@
           <w:rFonts w:ascii="Arial" w:hAnsi="Arial" w:cs="Arial"/>
           <w:sz w:val="28"/>
           <w:szCs w:val="28"/>
-        </w:rPr>
-      </w:pPr>
-    </w:p>
-    <w:p>
-      <w:pPr>
-        <w:spacing w:line="240" w:lineRule="auto"/>
-        <w:jc w:val="both"/>
-        <w:rPr>
-          <w:rFonts w:ascii="Arial" w:hAnsi="Arial" w:cs="Arial"/>
-          <w:sz w:val="28"/>
-          <w:szCs w:val="28"/>
           <w:u w:val="single"/>
         </w:rPr>
       </w:pPr>
@@ -1886,156 +1875,6 @@
         <w:jc w:val="both"/>
         <w:rPr>
           <w:rFonts w:ascii="Arial" w:hAnsi="Arial" w:cs="Arial"/>
-          <w:sz w:val="28"/>
-          <w:szCs w:val="28"/>
-        </w:rPr>
-      </w:pPr>
-    </w:p>
-    <w:p>
-      <w:pPr>
-        <w:jc w:val="both"/>
-        <w:rPr>
-          <w:rFonts w:ascii="Arial" w:hAnsi="Arial" w:cs="Arial"/>
-          <w:sz w:val="28"/>
-          <w:szCs w:val="28"/>
-        </w:rPr>
-      </w:pPr>
-    </w:p>
-    <w:p>
-      <w:pPr>
-        <w:jc w:val="both"/>
-        <w:rPr>
-          <w:rFonts w:ascii="Arial" w:hAnsi="Arial" w:cs="Arial"/>
-          <w:sz w:val="28"/>
-          <w:szCs w:val="28"/>
-        </w:rPr>
-      </w:pPr>
-    </w:p>
-    <w:p>
-      <w:pPr>
-        <w:jc w:val="both"/>
-        <w:rPr>
-          <w:rFonts w:ascii="Arial" w:hAnsi="Arial" w:cs="Arial"/>
-          <w:sz w:val="28"/>
-          <w:szCs w:val="28"/>
-        </w:rPr>
-      </w:pPr>
-    </w:p>
-    <w:p>
-      <w:pPr>
-        <w:jc w:val="both"/>
-        <w:rPr>
-          <w:rFonts w:ascii="Arial" w:hAnsi="Arial" w:cs="Arial"/>
-          <w:sz w:val="28"/>
-          <w:szCs w:val="28"/>
-        </w:rPr>
-      </w:pPr>
-    </w:p>
-    <w:p>
-      <w:pPr>
-        <w:jc w:val="both"/>
-        <w:rPr>
-          <w:rFonts w:ascii="Arial" w:hAnsi="Arial" w:cs="Arial"/>
-          <w:sz w:val="28"/>
-          <w:szCs w:val="28"/>
-        </w:rPr>
-      </w:pPr>
-    </w:p>
-    <w:p>
-      <w:pPr>
-        <w:jc w:val="both"/>
-        <w:rPr>
-          <w:rFonts w:ascii="Arial" w:hAnsi="Arial" w:cs="Arial"/>
-          <w:sz w:val="28"/>
-          <w:szCs w:val="28"/>
-        </w:rPr>
-      </w:pPr>
-    </w:p>
-    <w:p>
-      <w:pPr>
-        <w:jc w:val="both"/>
-        <w:rPr>
-          <w:rFonts w:ascii="Arial" w:hAnsi="Arial" w:cs="Arial"/>
-          <w:sz w:val="28"/>
-          <w:szCs w:val="28"/>
-        </w:rPr>
-      </w:pPr>
-    </w:p>
-    <w:p>
-      <w:pPr>
-        <w:jc w:val="both"/>
-        <w:rPr>
-          <w:rFonts w:ascii="Arial" w:hAnsi="Arial" w:cs="Arial"/>
-          <w:sz w:val="28"/>
-          <w:szCs w:val="28"/>
-        </w:rPr>
-      </w:pPr>
-    </w:p>
-    <w:p>
-      <w:pPr>
-        <w:jc w:val="both"/>
-        <w:rPr>
-          <w:rFonts w:ascii="Arial" w:hAnsi="Arial" w:cs="Arial"/>
-          <w:sz w:val="28"/>
-          <w:szCs w:val="28"/>
-        </w:rPr>
-      </w:pPr>
-    </w:p>
-    <w:p>
-      <w:pPr>
-        <w:jc w:val="both"/>
-        <w:rPr>
-          <w:rFonts w:ascii="Arial" w:hAnsi="Arial" w:cs="Arial"/>
-          <w:sz w:val="28"/>
-          <w:szCs w:val="28"/>
-        </w:rPr>
-      </w:pPr>
-    </w:p>
-    <w:p>
-      <w:pPr>
-        <w:jc w:val="both"/>
-        <w:rPr>
-          <w:rFonts w:ascii="Arial" w:hAnsi="Arial" w:cs="Arial"/>
-          <w:sz w:val="28"/>
-          <w:szCs w:val="28"/>
-        </w:rPr>
-      </w:pPr>
-    </w:p>
-    <w:p>
-      <w:pPr>
-        <w:jc w:val="both"/>
-        <w:rPr>
-          <w:rFonts w:ascii="Arial" w:hAnsi="Arial" w:cs="Arial"/>
-          <w:sz w:val="28"/>
-          <w:szCs w:val="28"/>
-        </w:rPr>
-      </w:pPr>
-    </w:p>
-    <w:p>
-      <w:pPr>
-        <w:jc w:val="both"/>
-        <w:rPr>
-          <w:rFonts w:ascii="Arial" w:hAnsi="Arial" w:cs="Arial"/>
-          <w:sz w:val="28"/>
-          <w:szCs w:val="28"/>
-        </w:rPr>
-      </w:pPr>
-    </w:p>
-    <w:p>
-      <w:pPr>
-        <w:jc w:val="both"/>
-        <w:rPr>
-          <w:rFonts w:ascii="Arial" w:hAnsi="Arial" w:cs="Arial"/>
-          <w:sz w:val="28"/>
-          <w:szCs w:val="28"/>
-        </w:rPr>
-      </w:pPr>
-    </w:p>
-    <w:p>
-      <w:pPr>
-        <w:jc w:val="both"/>
-        <w:rPr>
-          <w:rFonts w:ascii="Arial" w:hAnsi="Arial" w:cs="Arial"/>
           <w:b/>
           <w:bCs/>
           <w:sz w:val="32"/>
@@ -2052,6 +1891,7 @@
           <w:szCs w:val="32"/>
           <w:u w:val="single"/>
         </w:rPr>
+        <w:lastRenderedPageBreak/>
         <w:t>GITHUB LINK</w:t>
       </w:r>
     </w:p>
@@ -2064,6 +1904,35 @@
           <w:szCs w:val="28"/>
         </w:rPr>
       </w:pPr>
+      <w:hyperlink r:id="rId12" w:history="1">
+        <w:r>
+          <w:rPr>
+            <w:rStyle w:val="Hyperlink"/>
+            <w:rFonts w:ascii="Arial" w:hAnsi="Arial" w:cs="Arial"/>
+            <w:sz w:val="28"/>
+            <w:szCs w:val="28"/>
+          </w:rPr>
+          <w:t>https://github.com/VNa</w:t>
+        </w:r>
+        <w:r>
+          <w:rPr>
+            <w:rStyle w:val="Hyperlink"/>
+            <w:rFonts w:ascii="Arial" w:hAnsi="Arial" w:cs="Arial"/>
+            <w:sz w:val="28"/>
+            <w:szCs w:val="28"/>
+          </w:rPr>
+          <w:t>i</w:t>
+        </w:r>
+        <w:r>
+          <w:rPr>
+            <w:rStyle w:val="Hyperlink"/>
+            <w:rFonts w:ascii="Arial" w:hAnsi="Arial" w:cs="Arial"/>
+            <w:sz w:val="28"/>
+            <w:szCs w:val="28"/>
+          </w:rPr>
+          <w:t>doo-DEV/VIRAAT-NAIDOO-IMAD-ASSIGNMENT-1</w:t>
+        </w:r>
+      </w:hyperlink>
     </w:p>
     <w:p/>
     <w:sectPr>
@@ -3029,6 +2898,41 @@
       <w14:ligatures w14:val="none"/>
     </w:rPr>
   </w:style>
+  <w:style w:type="character" w:styleId="Hyperlink">
+    <w:name w:val="Hyperlink"/>
+    <w:basedOn w:val="DefaultParagraphFont"/>
+    <w:uiPriority w:val="99"/>
+    <w:unhideWhenUsed/>
+    <w:rsid w:val="0057550F"/>
+    <w:rPr>
+      <w:color w:val="467886" w:themeColor="hyperlink"/>
+      <w:u w:val="single"/>
+    </w:rPr>
+  </w:style>
+  <w:style w:type="character" w:styleId="UnresolvedMention">
+    <w:name w:val="Unresolved Mention"/>
+    <w:basedOn w:val="DefaultParagraphFont"/>
+    <w:uiPriority w:val="99"/>
+    <w:semiHidden/>
+    <w:unhideWhenUsed/>
+    <w:rsid w:val="0057550F"/>
+    <w:rPr>
+      <w:color w:val="605E5C"/>
+      <w:shd w:val="clear" w:color="auto" w:fill="E1DFDD"/>
+    </w:rPr>
+  </w:style>
+  <w:style w:type="character" w:styleId="FollowedHyperlink">
+    <w:name w:val="FollowedHyperlink"/>
+    <w:basedOn w:val="DefaultParagraphFont"/>
+    <w:uiPriority w:val="99"/>
+    <w:semiHidden/>
+    <w:unhideWhenUsed/>
+    <w:rsid w:val="0057550F"/>
+    <w:rPr>
+      <w:color w:val="96607D" w:themeColor="followedHyperlink"/>
+      <w:u w:val="single"/>
+    </w:rPr>
+  </w:style>
 </w:styles>
 </file>
 

</xml_diff>